<commit_message>
Remove bachelor’s degree from downloadable resume files
Regenerate resume.pdf, the DOCX, and a plain-text resume from shared copy that keeps the Pace M.S. only. Add a CI check so B.Tech / Tirumala / Cognizant wording cannot return in the site or resume assets.

Co-authored-by: Dineshgopi Sunkara <sunkara1111@users.noreply.github.com>
</commit_message>
<xml_diff>
--- a/public/assets/Sunkara-Dineshgopi-Resume.docx
+++ b/public/assets/Sunkara-Dineshgopi-Resume.docx
@@ -4,26 +4,29 @@
   <w:body>
     <w:p>
       <w:pPr>
-        <w:spacing w:before="0" w:after="40"/>
+        <w:spacing w:after="40"/>
         <w:jc w:val="center"/>
       </w:pPr>
       <w:r>
         <w:rPr>
-          <w:rFonts w:ascii="Times New Roman" w:hAnsi="Times New Roman"/>
+          <w:rFonts w:ascii="Calibri" w:hAnsi="Calibri" w:eastAsia="Calibri"/>
           <w:b/>
-          <w:sz w:val="36"/>
+          <w:color w:val="142038"/>
+          <w:sz w:val="40"/>
         </w:rPr>
         <w:t>Sunkara Dineshgopi</w:t>
       </w:r>
     </w:p>
     <w:p>
       <w:pPr>
-        <w:spacing w:after="160"/>
+        <w:spacing w:after="20"/>
         <w:jc w:val="center"/>
       </w:pPr>
       <w:r>
         <w:rPr>
-          <w:rFonts w:ascii="Times New Roman" w:hAnsi="Times New Roman"/>
+          <w:rFonts w:ascii="Calibri" w:hAnsi="Calibri" w:eastAsia="Calibri"/>
+          <w:b w:val="0"/>
+          <w:color w:val="464E5A"/>
           <w:sz w:val="20"/>
         </w:rPr>
         <w:t>M: 201-284-1559   |   E: dineshgopi.sunkara@gmail.com</w:t>
@@ -31,61 +34,88 @@
     </w:p>
     <w:p>
       <w:pPr>
-        <w:keepNext/>
-        <w:spacing w:before="240" w:after="60"/>
+        <w:spacing w:after="120"/>
+        <w:jc w:val="center"/>
+      </w:pPr>
+      <w:r>
+        <w:rPr>
+          <w:rFonts w:ascii="Calibri" w:hAnsi="Calibri" w:eastAsia="Calibri"/>
+          <w:b w:val="0"/>
+          <w:color w:val="464E5A"/>
+          <w:sz w:val="20"/>
+        </w:rPr>
+        <w:t>linkedin.com/in/sunkara-dineshgopi-86464919b   |   github.com/sunkara1111</w:t>
+      </w:r>
+    </w:p>
+    <w:p>
+      <w:pPr>
+        <w:spacing w:before="200" w:after="40"/>
         <w:pBdr>
-          <w:bottom w:val="single" w:sz="6" w:space="1" w:color="000000"/>
+          <w:bottom w:val="single" w:sz="8" w:space="1" w:color="283852"/>
         </w:pBdr>
       </w:pPr>
       <w:r>
         <w:rPr>
-          <w:rFonts w:ascii="Times New Roman" w:hAnsi="Times New Roman"/>
+          <w:rFonts w:ascii="Calibri" w:hAnsi="Calibri" w:eastAsia="Calibri"/>
           <w:b/>
-          <w:sz w:val="22"/>
+          <w:color w:val="142038"/>
+          <w:sz w:val="24"/>
         </w:rPr>
-        <w:t>Summary:</w:t>
+        <w:t>Summary</w:t>
       </w:r>
     </w:p>
     <w:p>
       <w:pPr>
-        <w:spacing w:after="80" w:line="276" w:lineRule="auto"/>
+        <w:spacing w:after="120"/>
       </w:pPr>
       <w:r>
-        <w:t>Results-driven Automation &amp; Controls Engineer and manufacturing quality professional specializing in industrial automation, Operational Technology (OT) platforms, Building Management Systems (BMS), and software architecture within highly regulated GxP / GMP environments. Combines an interdisciplinary engineering foundation across Information Technology (IT), Electronics &amp; Communication Engineering (ECE), and Computer Science (CS) to bridge the gap between physical plant machinery and complex software systems. Proven expertise in PLC/DCS architectures, SCADA design (Ignition, AVEVA), full-stack microservices development, cloud deployment, and strict data integrity compliance across pharmaceutical and industrial manufacturing lines.</w:t>
+        <w:rPr>
+          <w:rFonts w:ascii="Calibri" w:hAnsi="Calibri" w:eastAsia="Calibri"/>
+          <w:b w:val="0"/>
+          <w:color w:val="1C2026"/>
+          <w:sz w:val="21"/>
+        </w:rPr>
+        <w:t>Results-driven Automation &amp; Controls Engineer and manufacturing quality professional specializing in industrial automation, Operational Technology (OT) platforms, Building Management Systems (BMS), and software architecture within highly regulated GxP / GMP environments. Combines an interdisciplinary foundation across Information Technology (IT) and Computer Science (CS) to bridge the gap between physical plant machinery and complex software systems. Proven expertise in PLC/DCS architectures, SCADA design (Ignition, AVEVA), full-stack microservices development, cloud deployment, and strict data integrity compliance across pharmaceutical and industrial manufacturing lines.</w:t>
       </w:r>
     </w:p>
     <w:p>
       <w:pPr>
-        <w:keepNext/>
-        <w:spacing w:before="240" w:after="60"/>
+        <w:spacing w:before="200" w:after="40"/>
         <w:pBdr>
-          <w:bottom w:val="single" w:sz="6" w:space="1" w:color="000000"/>
+          <w:bottom w:val="single" w:sz="8" w:space="1" w:color="283852"/>
         </w:pBdr>
       </w:pPr>
       <w:r>
         <w:rPr>
-          <w:rFonts w:ascii="Times New Roman" w:hAnsi="Times New Roman"/>
+          <w:rFonts w:ascii="Calibri" w:hAnsi="Calibri" w:eastAsia="Calibri"/>
           <w:b/>
-          <w:sz w:val="22"/>
+          <w:color w:val="142038"/>
+          <w:sz w:val="24"/>
         </w:rPr>
-        <w:t>Skills:</w:t>
+        <w:t>Skills</w:t>
       </w:r>
     </w:p>
     <w:p>
       <w:pPr>
         <w:pStyle w:val="ListBullet"/>
-        <w:spacing w:after="50" w:line="276" w:lineRule="auto"/>
+        <w:spacing w:after="40"/>
+        <w:ind w:left="360"/>
       </w:pPr>
       <w:r>
         <w:rPr>
-          <w:rFonts w:ascii="Times New Roman" w:hAnsi="Times New Roman"/>
+          <w:rFonts w:ascii="Calibri" w:hAnsi="Calibri" w:eastAsia="Calibri"/>
           <w:b/>
+          <w:color w:val="142038"/>
+          <w:sz w:val="21"/>
         </w:rPr>
         <w:t xml:space="preserve">Automation &amp; Control Systems: </w:t>
       </w:r>
       <w:r>
         <w:rPr>
-          <w:rFonts w:ascii="Times New Roman" w:hAnsi="Times New Roman"/>
+          <w:rFonts w:ascii="Calibri" w:hAnsi="Calibri" w:eastAsia="Calibri"/>
+          <w:b w:val="0"/>
+          <w:color w:val="1C2026"/>
+          <w:sz w:val="21"/>
         </w:rPr>
         <w:t>PLC (Allen-Bradley, Siemens), DCS (DeltaV), SCADA (Ignition, FactoryTalk View, AVEVA), HMI Development, Vision Sensors, Sterile Fill-Finish Lines</w:t>
       </w:r>
@@ -93,18 +123,24 @@
     <w:p>
       <w:pPr>
         <w:pStyle w:val="ListBullet"/>
-        <w:spacing w:after="50" w:line="276" w:lineRule="auto"/>
+        <w:spacing w:after="40"/>
+        <w:ind w:left="360"/>
       </w:pPr>
       <w:r>
         <w:rPr>
-          <w:rFonts w:ascii="Times New Roman" w:hAnsi="Times New Roman"/>
+          <w:rFonts w:ascii="Calibri" w:hAnsi="Calibri" w:eastAsia="Calibri"/>
           <w:b/>
+          <w:color w:val="142038"/>
+          <w:sz w:val="21"/>
         </w:rPr>
         <w:t xml:space="preserve">Programming &amp; Configuration: </w:t>
       </w:r>
       <w:r>
         <w:rPr>
-          <w:rFonts w:ascii="Times New Roman" w:hAnsi="Times New Roman"/>
+          <w:rFonts w:ascii="Calibri" w:hAnsi="Calibri" w:eastAsia="Calibri"/>
+          <w:b w:val="0"/>
+          <w:color w:val="1C2026"/>
+          <w:sz w:val="21"/>
         </w:rPr>
         <w:t>Rockwell Studio 5000, RSLogix 500/5000, Ladder Logic, Structured Text, Python, JavaScript, Java (Spring Boot, Hibernate), SQL</w:t>
       </w:r>
@@ -112,18 +148,24 @@
     <w:p>
       <w:pPr>
         <w:pStyle w:val="ListBullet"/>
-        <w:spacing w:after="50" w:line="276" w:lineRule="auto"/>
+        <w:spacing w:after="40"/>
+        <w:ind w:left="360"/>
       </w:pPr>
       <w:r>
         <w:rPr>
-          <w:rFonts w:ascii="Times New Roman" w:hAnsi="Times New Roman"/>
+          <w:rFonts w:ascii="Calibri" w:hAnsi="Calibri" w:eastAsia="Calibri"/>
           <w:b/>
+          <w:color w:val="142038"/>
+          <w:sz w:val="21"/>
         </w:rPr>
         <w:t xml:space="preserve">MES &amp; Digital Systems: </w:t>
       </w:r>
       <w:r>
         <w:rPr>
-          <w:rFonts w:ascii="Times New Roman" w:hAnsi="Times New Roman"/>
+          <w:rFonts w:ascii="Calibri" w:hAnsi="Calibri" w:eastAsia="Calibri"/>
+          <w:b w:val="0"/>
+          <w:color w:val="1C2026"/>
+          <w:sz w:val="21"/>
         </w:rPr>
         <w:t>Syncade, MasterControl, Electronic Batch Records (EBR), Recipe Authoring, MES–DCS Integration, MES Transactions</w:t>
       </w:r>
@@ -131,18 +173,24 @@
     <w:p>
       <w:pPr>
         <w:pStyle w:val="ListBullet"/>
-        <w:spacing w:after="50" w:line="276" w:lineRule="auto"/>
+        <w:spacing w:after="40"/>
+        <w:ind w:left="360"/>
       </w:pPr>
       <w:r>
         <w:rPr>
-          <w:rFonts w:ascii="Times New Roman" w:hAnsi="Times New Roman"/>
+          <w:rFonts w:ascii="Calibri" w:hAnsi="Calibri" w:eastAsia="Calibri"/>
           <w:b/>
+          <w:color w:val="142038"/>
+          <w:sz w:val="21"/>
         </w:rPr>
         <w:t xml:space="preserve">Validation &amp; Compliance: </w:t>
       </w:r>
       <w:r>
         <w:rPr>
-          <w:rFonts w:ascii="Times New Roman" w:hAnsi="Times New Roman"/>
+          <w:rFonts w:ascii="Calibri" w:hAnsi="Calibri" w:eastAsia="Calibri"/>
+          <w:b w:val="0"/>
+          <w:color w:val="1C2026"/>
+          <w:sz w:val="21"/>
         </w:rPr>
         <w:t>GMP, GxP, 21 CFR Part 11, GAMP 5, IQ/OQ/UAT, FAT/SAT, Change Control, CAPA, Data Integrity, System Risk Assessment</w:t>
       </w:r>
@@ -150,18 +198,24 @@
     <w:p>
       <w:pPr>
         <w:pStyle w:val="ListBullet"/>
-        <w:spacing w:after="50" w:line="276" w:lineRule="auto"/>
+        <w:spacing w:after="40"/>
+        <w:ind w:left="360"/>
       </w:pPr>
       <w:r>
         <w:rPr>
-          <w:rFonts w:ascii="Times New Roman" w:hAnsi="Times New Roman"/>
+          <w:rFonts w:ascii="Calibri" w:hAnsi="Calibri" w:eastAsia="Calibri"/>
           <w:b/>
+          <w:color w:val="142038"/>
+          <w:sz w:val="21"/>
         </w:rPr>
         <w:t xml:space="preserve">Batch &amp; Process Standards: </w:t>
       </w:r>
       <w:r>
         <w:rPr>
-          <w:rFonts w:ascii="Times New Roman" w:hAnsi="Times New Roman"/>
+          <w:rFonts w:ascii="Calibri" w:hAnsi="Calibri" w:eastAsia="Calibri"/>
+          <w:b w:val="0"/>
+          <w:color w:val="1C2026"/>
+          <w:sz w:val="21"/>
         </w:rPr>
         <w:t>ISA S88, ISA S95, Batch Process Design, Recipe Management, Process Optimization</w:t>
       </w:r>
@@ -169,18 +223,24 @@
     <w:p>
       <w:pPr>
         <w:pStyle w:val="ListBullet"/>
-        <w:spacing w:after="50" w:line="276" w:lineRule="auto"/>
+        <w:spacing w:after="40"/>
+        <w:ind w:left="360"/>
       </w:pPr>
       <w:r>
         <w:rPr>
-          <w:rFonts w:ascii="Times New Roman" w:hAnsi="Times New Roman"/>
+          <w:rFonts w:ascii="Calibri" w:hAnsi="Calibri" w:eastAsia="Calibri"/>
           <w:b/>
+          <w:color w:val="142038"/>
+          <w:sz w:val="21"/>
         </w:rPr>
         <w:t xml:space="preserve">Networking/Integration: </w:t>
       </w:r>
       <w:r>
         <w:rPr>
-          <w:rFonts w:ascii="Times New Roman" w:hAnsi="Times New Roman"/>
+          <w:rFonts w:ascii="Calibri" w:hAnsi="Calibri" w:eastAsia="Calibri"/>
+          <w:b w:val="0"/>
+          <w:color w:val="1C2026"/>
+          <w:sz w:val="21"/>
         </w:rPr>
         <w:t>OPC, Ethernet/IP, Industrial Networks, System Integration, SQL Server (ODBC/DSN Connectivity), Data Historians (OSI PI)</w:t>
       </w:r>
@@ -188,18 +248,24 @@
     <w:p>
       <w:pPr>
         <w:pStyle w:val="ListBullet"/>
-        <w:spacing w:after="50" w:line="276" w:lineRule="auto"/>
+        <w:spacing w:after="40"/>
+        <w:ind w:left="360"/>
       </w:pPr>
       <w:r>
         <w:rPr>
-          <w:rFonts w:ascii="Times New Roman" w:hAnsi="Times New Roman"/>
+          <w:rFonts w:ascii="Calibri" w:hAnsi="Calibri" w:eastAsia="Calibri"/>
           <w:b/>
+          <w:color w:val="142038"/>
+          <w:sz w:val="21"/>
         </w:rPr>
         <w:t xml:space="preserve">Building &amp; Utility Systems: </w:t>
       </w:r>
       <w:r>
         <w:rPr>
-          <w:rFonts w:ascii="Times New Roman" w:hAnsi="Times New Roman"/>
+          <w:rFonts w:ascii="Calibri" w:hAnsi="Calibri" w:eastAsia="Calibri"/>
+          <w:b w:val="0"/>
+          <w:color w:val="1C2026"/>
+          <w:sz w:val="21"/>
         </w:rPr>
         <w:t>BAS/BMS (Siemens Desigo, Insight), Environmental Monitoring Systems (EMS), Cleanroom Systems, Process Equipment Integration</w:t>
       </w:r>
@@ -207,18 +273,24 @@
     <w:p>
       <w:pPr>
         <w:pStyle w:val="ListBullet"/>
-        <w:spacing w:after="50" w:line="276" w:lineRule="auto"/>
+        <w:spacing w:after="40"/>
+        <w:ind w:left="360"/>
       </w:pPr>
       <w:r>
         <w:rPr>
-          <w:rFonts w:ascii="Times New Roman" w:hAnsi="Times New Roman"/>
+          <w:rFonts w:ascii="Calibri" w:hAnsi="Calibri" w:eastAsia="Calibri"/>
           <w:b/>
+          <w:color w:val="142038"/>
+          <w:sz w:val="21"/>
         </w:rPr>
         <w:t xml:space="preserve">Troubleshooting &amp; Maintenance: </w:t>
       </w:r>
       <w:r>
         <w:rPr>
-          <w:rFonts w:ascii="Times New Roman" w:hAnsi="Times New Roman"/>
+          <w:rFonts w:ascii="Calibri" w:hAnsi="Calibri" w:eastAsia="Calibri"/>
+          <w:b w:val="0"/>
+          <w:color w:val="1C2026"/>
+          <w:sz w:val="21"/>
         </w:rPr>
         <w:t>Root Cause Analysis (RCA), PLC/SCADA Diagnostics, I/O &amp; Communication Failures, Preventive Maintenance</w:t>
       </w:r>
@@ -226,59 +298,67 @@
     <w:p>
       <w:pPr>
         <w:pStyle w:val="ListBullet"/>
-        <w:spacing w:after="50" w:line="276" w:lineRule="auto"/>
+        <w:spacing w:after="40"/>
+        <w:ind w:left="360"/>
       </w:pPr>
       <w:r>
         <w:rPr>
-          <w:rFonts w:ascii="Times New Roman" w:hAnsi="Times New Roman"/>
+          <w:rFonts w:ascii="Calibri" w:hAnsi="Calibri" w:eastAsia="Calibri"/>
           <w:b/>
+          <w:color w:val="142038"/>
+          <w:sz w:val="21"/>
         </w:rPr>
         <w:t xml:space="preserve">Software &amp; Cloud Infrastructure: </w:t>
       </w:r>
       <w:r>
         <w:rPr>
-          <w:rFonts w:ascii="Times New Roman" w:hAnsi="Times New Roman"/>
+          <w:rFonts w:ascii="Calibri" w:hAnsi="Calibri" w:eastAsia="Calibri"/>
+          <w:b w:val="0"/>
+          <w:color w:val="1C2026"/>
+          <w:sz w:val="21"/>
         </w:rPr>
         <w:t>Microservices Architecture, RESTful &amp; SOAP Web Services, Docker, Jenkins, Git, AWS, Azure, CI/CD Pipelines, JUnit, Mockito</w:t>
       </w:r>
     </w:p>
     <w:p>
       <w:pPr>
-        <w:keepNext/>
-        <w:spacing w:before="240" w:after="60"/>
+        <w:spacing w:before="200" w:after="40"/>
         <w:pBdr>
-          <w:bottom w:val="single" w:sz="6" w:space="1" w:color="000000"/>
+          <w:bottom w:val="single" w:sz="8" w:space="1" w:color="283852"/>
         </w:pBdr>
       </w:pPr>
       <w:r>
         <w:rPr>
-          <w:rFonts w:ascii="Times New Roman" w:hAnsi="Times New Roman"/>
+          <w:rFonts w:ascii="Calibri" w:hAnsi="Calibri" w:eastAsia="Calibri"/>
           <w:b/>
-          <w:sz w:val="22"/>
+          <w:color w:val="142038"/>
+          <w:sz w:val="24"/>
         </w:rPr>
-        <w:t>Experience:</w:t>
+        <w:t>Experience</w:t>
       </w:r>
     </w:p>
     <w:p>
       <w:pPr>
         <w:tabs>
-          <w:tab w:pos="10080" w:val="right"/>
+          <w:tab w:pos="10224" w:val="right"/>
         </w:tabs>
-        <w:spacing w:before="120" w:after="20"/>
+        <w:spacing w:before="160" w:after="0"/>
       </w:pPr>
       <w:r>
         <w:rPr>
-          <w:rFonts w:ascii="Times New Roman" w:hAnsi="Times New Roman"/>
+          <w:rFonts w:ascii="Calibri" w:hAnsi="Calibri" w:eastAsia="Calibri"/>
           <w:b/>
-          <w:sz w:val="21"/>
+          <w:color w:val="142038"/>
+          <w:sz w:val="22"/>
         </w:rPr>
         <w:t>Jubilant HollisterStier | Spokane, WA (On-Site)</w:t>
       </w:r>
       <w:r>
         <w:rPr>
-          <w:rFonts w:ascii="Times New Roman" w:hAnsi="Times New Roman"/>
+          <w:rFonts w:ascii="Calibri" w:hAnsi="Calibri" w:eastAsia="Calibri"/>
           <w:b/>
-          <w:sz w:val="20"/>
+          <w:color w:val="142038"/>
+          <w:sz w:val="21"/>
         </w:rPr>
         <w:tab/>
         <w:t>Jun 2026 – Present</w:t>
@@ -286,13 +366,14 @@
     </w:p>
     <w:p>
       <w:pPr>
-        <w:spacing w:before="0" w:after="40"/>
+        <w:spacing w:after="40"/>
       </w:pPr>
       <w:r>
         <w:rPr>
-          <w:rFonts w:ascii="Times New Roman" w:hAnsi="Times New Roman"/>
-          <w:i/>
-          <w:sz w:val="20"/>
+          <w:rFonts w:ascii="Calibri" w:hAnsi="Calibri" w:eastAsia="Calibri"/>
+          <w:b w:val="0"/>
+          <w:color w:val="1C2026"/>
+          <w:sz w:val="21"/>
         </w:rPr>
         <w:t>Automation Engineer</w:t>
       </w:r>
@@ -300,12 +381,15 @@
     <w:p>
       <w:pPr>
         <w:pStyle w:val="ListBullet"/>
-        <w:spacing w:after="40" w:line="276" w:lineRule="auto"/>
+        <w:spacing w:after="40"/>
+        <w:ind w:left="360"/>
       </w:pPr>
       <w:r>
         <w:rPr>
-          <w:rFonts w:ascii="Times New Roman" w:hAnsi="Times New Roman"/>
-          <w:sz w:val="19"/>
+          <w:rFonts w:ascii="Calibri" w:hAnsi="Calibri" w:eastAsia="Calibri"/>
+          <w:b w:val="0"/>
+          <w:color w:val="1C2026"/>
+          <w:sz w:val="20"/>
         </w:rPr>
         <w:t>Develop custom Ignition SCADA modules using Python and JavaScript scripting to automate data processing from vision sensors and generate dynamic operator dashboards for real-time plant monitoring.</w:t>
       </w:r>
@@ -313,12 +397,15 @@
     <w:p>
       <w:pPr>
         <w:pStyle w:val="ListBullet"/>
-        <w:spacing w:after="40" w:line="276" w:lineRule="auto"/>
+        <w:spacing w:after="40"/>
+        <w:ind w:left="360"/>
       </w:pPr>
       <w:r>
         <w:rPr>
-          <w:rFonts w:ascii="Times New Roman" w:hAnsi="Times New Roman"/>
-          <w:sz w:val="19"/>
+          <w:rFonts w:ascii="Calibri" w:hAnsi="Calibri" w:eastAsia="Calibri"/>
+          <w:b w:val="0"/>
+          <w:color w:val="1C2026"/>
+          <w:sz w:val="20"/>
         </w:rPr>
         <w:t>Design and implement an automated quality control system integrating Rockwell PLCs with AVEVA SCADA for centralized monitoring and real-time visualization of inspection metrics.</w:t>
       </w:r>
@@ -326,12 +413,15 @@
     <w:p>
       <w:pPr>
         <w:pStyle w:val="ListBullet"/>
-        <w:spacing w:after="40" w:line="276" w:lineRule="auto"/>
+        <w:spacing w:after="40"/>
+        <w:ind w:left="360"/>
       </w:pPr>
       <w:r>
         <w:rPr>
-          <w:rFonts w:ascii="Times New Roman" w:hAnsi="Times New Roman"/>
-          <w:sz w:val="19"/>
+          <w:rFonts w:ascii="Calibri" w:hAnsi="Calibri" w:eastAsia="Calibri"/>
+          <w:b w:val="0"/>
+          <w:color w:val="1C2026"/>
+          <w:sz w:val="20"/>
         </w:rPr>
         <w:t>Direct the integration, programming, and troubleshooting of control systems with sterile fill-finish lines, managing automated workflows across laboratory and pharmaceutical manufacturing environments.</w:t>
       </w:r>
@@ -339,12 +429,15 @@
     <w:p>
       <w:pPr>
         <w:pStyle w:val="ListBullet"/>
-        <w:spacing w:after="40" w:line="276" w:lineRule="auto"/>
+        <w:spacing w:after="40"/>
+        <w:ind w:left="360"/>
       </w:pPr>
       <w:r>
         <w:rPr>
-          <w:rFonts w:ascii="Times New Roman" w:hAnsi="Times New Roman"/>
-          <w:sz w:val="19"/>
+          <w:rFonts w:ascii="Calibri" w:hAnsi="Calibri" w:eastAsia="Calibri"/>
+          <w:b w:val="0"/>
+          <w:color w:val="1C2026"/>
+          <w:sz w:val="20"/>
         </w:rPr>
         <w:t>Configure and validate ODBC and DSN connectivity between OT applications and SQL Server databases to support Environmental Monitoring Systems (EMS) and OT data capture on filling lines.</w:t>
       </w:r>
@@ -352,12 +445,15 @@
     <w:p>
       <w:pPr>
         <w:pStyle w:val="ListBullet"/>
-        <w:spacing w:after="40" w:line="276" w:lineRule="auto"/>
+        <w:spacing w:after="40"/>
+        <w:ind w:left="360"/>
       </w:pPr>
       <w:r>
         <w:rPr>
-          <w:rFonts w:ascii="Times New Roman" w:hAnsi="Times New Roman"/>
-          <w:sz w:val="19"/>
+          <w:rFonts w:ascii="Calibri" w:hAnsi="Calibri" w:eastAsia="Calibri"/>
+          <w:b w:val="0"/>
+          <w:color w:val="1C2026"/>
+          <w:sz w:val="20"/>
         </w:rPr>
         <w:t>Integrate automation systems with SQL Server databases for production data logging, compliance reporting, and Manufacturing Execution System (MES) transactions while executing structured system risk assessments.</w:t>
       </w:r>
@@ -365,23 +461,25 @@
     <w:p>
       <w:pPr>
         <w:tabs>
-          <w:tab w:pos="10080" w:val="right"/>
+          <w:tab w:pos="10224" w:val="right"/>
         </w:tabs>
-        <w:spacing w:before="120" w:after="20"/>
+        <w:spacing w:before="160" w:after="0"/>
       </w:pPr>
       <w:r>
         <w:rPr>
-          <w:rFonts w:ascii="Times New Roman" w:hAnsi="Times New Roman"/>
+          <w:rFonts w:ascii="Calibri" w:hAnsi="Calibri" w:eastAsia="Calibri"/>
           <w:b/>
-          <w:sz w:val="21"/>
+          <w:color w:val="142038"/>
+          <w:sz w:val="22"/>
         </w:rPr>
         <w:t>Source Sphere LLC | Edison, NJ (Hybrid)</w:t>
       </w:r>
       <w:r>
         <w:rPr>
-          <w:rFonts w:ascii="Times New Roman" w:hAnsi="Times New Roman"/>
+          <w:rFonts w:ascii="Calibri" w:hAnsi="Calibri" w:eastAsia="Calibri"/>
           <w:b/>
-          <w:sz w:val="20"/>
+          <w:color w:val="142038"/>
+          <w:sz w:val="21"/>
         </w:rPr>
         <w:tab/>
         <w:t>Nov 2025 – Jun 2026</w:t>
@@ -389,13 +487,14 @@
     </w:p>
     <w:p>
       <w:pPr>
-        <w:spacing w:before="0" w:after="40"/>
+        <w:spacing w:after="40"/>
       </w:pPr>
       <w:r>
         <w:rPr>
-          <w:rFonts w:ascii="Times New Roman" w:hAnsi="Times New Roman"/>
-          <w:i/>
-          <w:sz w:val="20"/>
+          <w:rFonts w:ascii="Calibri" w:hAnsi="Calibri" w:eastAsia="Calibri"/>
+          <w:b w:val="0"/>
+          <w:color w:val="1C2026"/>
+          <w:sz w:val="21"/>
         </w:rPr>
         <w:t>Software Engineer</w:t>
       </w:r>
@@ -403,12 +502,15 @@
     <w:p>
       <w:pPr>
         <w:pStyle w:val="ListBullet"/>
-        <w:spacing w:after="40" w:line="276" w:lineRule="auto"/>
+        <w:spacing w:after="40"/>
+        <w:ind w:left="360"/>
       </w:pPr>
       <w:r>
         <w:rPr>
-          <w:rFonts w:ascii="Times New Roman" w:hAnsi="Times New Roman"/>
-          <w:sz w:val="19"/>
+          <w:rFonts w:ascii="Calibri" w:hAnsi="Calibri" w:eastAsia="Calibri"/>
+          <w:b w:val="0"/>
+          <w:color w:val="1C2026"/>
+          <w:sz w:val="20"/>
         </w:rPr>
         <w:t>Architected, developed, and deployed scalable Java-based applications and microservices using Spring Boot and Hibernate, seamlessly linking core CS algorithms with resilient IT infrastructure.</w:t>
       </w:r>
@@ -416,12 +518,15 @@
     <w:p>
       <w:pPr>
         <w:pStyle w:val="ListBullet"/>
-        <w:spacing w:after="40" w:line="276" w:lineRule="auto"/>
+        <w:spacing w:after="40"/>
+        <w:ind w:left="360"/>
       </w:pPr>
       <w:r>
         <w:rPr>
-          <w:rFonts w:ascii="Times New Roman" w:hAnsi="Times New Roman"/>
-          <w:sz w:val="19"/>
+          <w:rFonts w:ascii="Calibri" w:hAnsi="Calibri" w:eastAsia="Calibri"/>
+          <w:b w:val="0"/>
+          <w:color w:val="1C2026"/>
+          <w:sz w:val="20"/>
         </w:rPr>
         <w:t>Designed and integrated high-performance RESTful and SOAP-based web services to optimize application communication and ensure smooth UI integration with frontend engineering teams.</w:t>
       </w:r>
@@ -429,12 +534,15 @@
     <w:p>
       <w:pPr>
         <w:pStyle w:val="ListBullet"/>
-        <w:spacing w:after="40" w:line="276" w:lineRule="auto"/>
+        <w:spacing w:after="40"/>
+        <w:ind w:left="360"/>
       </w:pPr>
       <w:r>
         <w:rPr>
-          <w:rFonts w:ascii="Times New Roman" w:hAnsi="Times New Roman"/>
-          <w:sz w:val="19"/>
+          <w:rFonts w:ascii="Calibri" w:hAnsi="Calibri" w:eastAsia="Calibri"/>
+          <w:b w:val="0"/>
+          <w:color w:val="1C2026"/>
+          <w:sz w:val="20"/>
         </w:rPr>
         <w:t>Managed end-to-end data modeling, schema design, and complex query development utilizing MySQL, PostgreSQL, and MongoDB, maintaining strict data integrity and performance standards.</w:t>
       </w:r>
@@ -442,12 +550,15 @@
     <w:p>
       <w:pPr>
         <w:pStyle w:val="ListBullet"/>
-        <w:spacing w:after="40" w:line="276" w:lineRule="auto"/>
+        <w:spacing w:after="40"/>
+        <w:ind w:left="360"/>
       </w:pPr>
       <w:r>
         <w:rPr>
-          <w:rFonts w:ascii="Times New Roman" w:hAnsi="Times New Roman"/>
-          <w:sz w:val="19"/>
+          <w:rFonts w:ascii="Calibri" w:hAnsi="Calibri" w:eastAsia="Calibri"/>
+          <w:b w:val="0"/>
+          <w:color w:val="1C2026"/>
+          <w:sz w:val="20"/>
         </w:rPr>
         <w:t>Drove continuous integration and deployment (CI/CD) workflows by contributing to automated pipelines using Jenkins, Git, and Docker across AWS and Azure cloud platforms.</w:t>
       </w:r>
@@ -455,12 +566,15 @@
     <w:p>
       <w:pPr>
         <w:pStyle w:val="ListBullet"/>
-        <w:spacing w:after="40" w:line="276" w:lineRule="auto"/>
+        <w:spacing w:after="40"/>
+        <w:ind w:left="360"/>
       </w:pPr>
       <w:r>
         <w:rPr>
-          <w:rFonts w:ascii="Times New Roman" w:hAnsi="Times New Roman"/>
-          <w:sz w:val="19"/>
+          <w:rFonts w:ascii="Calibri" w:hAnsi="Calibri" w:eastAsia="Calibri"/>
+          <w:b w:val="0"/>
+          <w:color w:val="1C2026"/>
+          <w:sz w:val="20"/>
         </w:rPr>
         <w:t>Guided the full Software Development Lifecycle (SDLC), ensuring code reliability through JUnit and Mockito unit testing, conducting peer code reviews, and optimizing performance via caching and code tuning.</w:t>
       </w:r>
@@ -468,113 +582,25 @@
     <w:p>
       <w:pPr>
         <w:tabs>
-          <w:tab w:pos="10080" w:val="right"/>
+          <w:tab w:pos="10224" w:val="right"/>
         </w:tabs>
-        <w:spacing w:before="120" w:after="20"/>
+        <w:spacing w:before="160" w:after="0"/>
       </w:pPr>
       <w:r>
         <w:rPr>
-          <w:rFonts w:ascii="Times New Roman" w:hAnsi="Times New Roman"/>
+          <w:rFonts w:ascii="Calibri" w:hAnsi="Calibri" w:eastAsia="Calibri"/>
           <w:b/>
-          <w:sz w:val="21"/>
-        </w:rPr>
-        <w:t>Cognizant | Chennai, India (Remote)</w:t>
-      </w:r>
-      <w:r>
-        <w:rPr>
-          <w:rFonts w:ascii="Times New Roman" w:hAnsi="Times New Roman"/>
-          <w:b/>
-          <w:sz w:val="20"/>
-        </w:rPr>
-        <w:tab/>
-        <w:t>Aug 2020 – Mar 2023</w:t>
-      </w:r>
-    </w:p>
-    <w:p>
-      <w:pPr>
-        <w:spacing w:before="0" w:after="40"/>
-      </w:pPr>
-      <w:r>
-        <w:rPr>
-          <w:rFonts w:ascii="Times New Roman" w:hAnsi="Times New Roman"/>
-          <w:i/>
-          <w:sz w:val="20"/>
-        </w:rPr>
-        <w:t>Program Analyst</w:t>
-      </w:r>
-    </w:p>
-    <w:p>
-      <w:pPr>
-        <w:pStyle w:val="ListBullet"/>
-        <w:spacing w:after="40" w:line="276" w:lineRule="auto"/>
-      </w:pPr>
-      <w:r>
-        <w:rPr>
-          <w:rFonts w:ascii="Times New Roman" w:hAnsi="Times New Roman"/>
-          <w:sz w:val="19"/>
-        </w:rPr>
-        <w:t>Developed and deployed an automated reporting solution utilizing Python, SQL, and Power BI to streamline operational tracking, eliminating manual workflows to reclaim 20+ weekly hours while boosting data accuracy by 40%.</w:t>
-      </w:r>
-    </w:p>
-    <w:p>
-      <w:pPr>
-        <w:pStyle w:val="ListBullet"/>
-        <w:spacing w:after="40" w:line="276" w:lineRule="auto"/>
-      </w:pPr>
-      <w:r>
-        <w:rPr>
-          <w:rFonts w:ascii="Times New Roman" w:hAnsi="Times New Roman"/>
-          <w:sz w:val="19"/>
-        </w:rPr>
-        <w:t>Partnered with cross-functional engineering and product teams to re-engineer core data pipelines, leveraging an interdisciplinary mix of IT, ECE, and CS to significantly improve data throughput and workflow reliability.</w:t>
-      </w:r>
-    </w:p>
-    <w:p>
-      <w:pPr>
-        <w:pStyle w:val="ListBullet"/>
-        <w:spacing w:after="40" w:line="276" w:lineRule="auto"/>
-      </w:pPr>
-      <w:r>
-        <w:rPr>
-          <w:rFonts w:ascii="Times New Roman" w:hAnsi="Times New Roman"/>
-          <w:sz w:val="19"/>
-        </w:rPr>
-        <w:t>Led root cause analysis (RCA) for critical system errors and production incidents, implementing robust technical solutions that enhanced overall stability and slashed system downtime by 30%.</w:t>
-      </w:r>
-    </w:p>
-    <w:p>
-      <w:pPr>
-        <w:pStyle w:val="ListBullet"/>
-        <w:spacing w:after="40" w:line="276" w:lineRule="auto"/>
-      </w:pPr>
-      <w:r>
-        <w:rPr>
-          <w:rFonts w:ascii="Times New Roman" w:hAnsi="Times New Roman"/>
-          <w:sz w:val="19"/>
-        </w:rPr>
-        <w:t>Orchestrated the monthly generation and analysis of 50+ complex operational reports, delivering actionable insights that drove client system efficiency and informed strategic business decisions.</w:t>
-      </w:r>
-    </w:p>
-    <w:p>
-      <w:pPr>
-        <w:tabs>
-          <w:tab w:pos="10080" w:val="right"/>
-        </w:tabs>
-        <w:spacing w:before="120" w:after="20"/>
-      </w:pPr>
-      <w:r>
-        <w:rPr>
-          <w:rFonts w:ascii="Times New Roman" w:hAnsi="Times New Roman"/>
-          <w:b/>
-          <w:sz w:val="21"/>
+          <w:color w:val="142038"/>
+          <w:sz w:val="22"/>
         </w:rPr>
         <w:t>Andhra Pradesh State Skill Development Corporation (APSSDC) | Andhra Pradesh, India</w:t>
       </w:r>
       <w:r>
         <w:rPr>
-          <w:rFonts w:ascii="Times New Roman" w:hAnsi="Times New Roman"/>
+          <w:rFonts w:ascii="Calibri" w:hAnsi="Calibri" w:eastAsia="Calibri"/>
           <w:b/>
-          <w:sz w:val="20"/>
+          <w:color w:val="142038"/>
+          <w:sz w:val="21"/>
         </w:rPr>
         <w:tab/>
         <w:t>Apr 2019 – Apr 2020</w:t>
@@ -582,13 +608,14 @@
     </w:p>
     <w:p>
       <w:pPr>
-        <w:spacing w:before="0" w:after="40"/>
+        <w:spacing w:after="40"/>
       </w:pPr>
       <w:r>
         <w:rPr>
-          <w:rFonts w:ascii="Times New Roman" w:hAnsi="Times New Roman"/>
-          <w:i/>
-          <w:sz w:val="20"/>
+          <w:rFonts w:ascii="Calibri" w:hAnsi="Calibri" w:eastAsia="Calibri"/>
+          <w:b w:val="0"/>
+          <w:color w:val="1C2026"/>
+          <w:sz w:val="21"/>
         </w:rPr>
         <w:t>Intern – Industrial Automation &amp; Controls</w:t>
       </w:r>
@@ -596,12 +623,15 @@
     <w:p>
       <w:pPr>
         <w:pStyle w:val="ListBullet"/>
-        <w:spacing w:after="40" w:line="276" w:lineRule="auto"/>
+        <w:spacing w:after="40"/>
+        <w:ind w:left="360"/>
       </w:pPr>
       <w:r>
         <w:rPr>
-          <w:rFonts w:ascii="Times New Roman" w:hAnsi="Times New Roman"/>
-          <w:sz w:val="19"/>
+          <w:rFonts w:ascii="Calibri" w:hAnsi="Calibri" w:eastAsia="Calibri"/>
+          <w:b w:val="0"/>
+          <w:color w:val="1C2026"/>
+          <w:sz w:val="20"/>
         </w:rPr>
         <w:t>Gained hands-on exposure to core manufacturing industry ecosystems, industrial automation workflows, embedded microcontrollers, and production line lifecycles.</w:t>
       </w:r>
@@ -609,12 +639,15 @@
     <w:p>
       <w:pPr>
         <w:pStyle w:val="ListBullet"/>
-        <w:spacing w:after="40" w:line="276" w:lineRule="auto"/>
+        <w:spacing w:after="40"/>
+        <w:ind w:left="360"/>
       </w:pPr>
       <w:r>
         <w:rPr>
-          <w:rFonts w:ascii="Times New Roman" w:hAnsi="Times New Roman"/>
-          <w:sz w:val="19"/>
+          <w:rFonts w:ascii="Calibri" w:hAnsi="Calibri" w:eastAsia="Calibri"/>
+          <w:b w:val="0"/>
+          <w:color w:val="1C2026"/>
+          <w:sz w:val="20"/>
         </w:rPr>
         <w:t>Developed a foundational understanding of industrial control logic, including how Programmable Logic Controllers (PLCs) interface with supervisory software architectures to manage plant floor equipment.</w:t>
       </w:r>
@@ -622,12 +655,15 @@
     <w:p>
       <w:pPr>
         <w:pStyle w:val="ListBullet"/>
-        <w:spacing w:after="40" w:line="276" w:lineRule="auto"/>
+        <w:spacing w:after="40"/>
+        <w:ind w:left="360"/>
       </w:pPr>
       <w:r>
         <w:rPr>
-          <w:rFonts w:ascii="Times New Roman" w:hAnsi="Times New Roman"/>
-          <w:sz w:val="19"/>
+          <w:rFonts w:ascii="Calibri" w:hAnsi="Calibri" w:eastAsia="Calibri"/>
+          <w:b w:val="0"/>
+          <w:color w:val="1C2026"/>
+          <w:sz w:val="20"/>
         </w:rPr>
         <w:t>Studied manufacturing documentation standards, safety regulations, and data tracking methods used to ensure precision, structural reliability, and operational continuity in fast-paced production environments.</w:t>
       </w:r>
@@ -635,106 +671,77 @@
     <w:p>
       <w:pPr>
         <w:pStyle w:val="ListBullet"/>
-        <w:spacing w:after="40" w:line="276" w:lineRule="auto"/>
+        <w:spacing w:after="40"/>
+        <w:ind w:left="360"/>
       </w:pPr>
       <w:r>
         <w:rPr>
-          <w:rFonts w:ascii="Times New Roman" w:hAnsi="Times New Roman"/>
-          <w:sz w:val="19"/>
+          <w:rFonts w:ascii="Calibri" w:hAnsi="Calibri" w:eastAsia="Calibri"/>
+          <w:b w:val="0"/>
+          <w:color w:val="1C2026"/>
+          <w:sz w:val="20"/>
         </w:rPr>
         <w:t>Participated in cross-functional technical workshops aimed at deploying hardware-software integrations, sharpening troubleshooting, technical analysis, and systems validation capabilities.</w:t>
       </w:r>
     </w:p>
     <w:p>
       <w:pPr>
-        <w:keepNext/>
-        <w:spacing w:before="240" w:after="60"/>
+        <w:spacing w:before="200" w:after="40"/>
         <w:pBdr>
-          <w:bottom w:val="single" w:sz="6" w:space="1" w:color="000000"/>
+          <w:bottom w:val="single" w:sz="8" w:space="1" w:color="283852"/>
         </w:pBdr>
       </w:pPr>
       <w:r>
         <w:rPr>
-          <w:rFonts w:ascii="Times New Roman" w:hAnsi="Times New Roman"/>
+          <w:rFonts w:ascii="Calibri" w:hAnsi="Calibri" w:eastAsia="Calibri"/>
           <w:b/>
-          <w:sz w:val="22"/>
+          <w:color w:val="142038"/>
+          <w:sz w:val="24"/>
         </w:rPr>
-        <w:t>Education:</w:t>
+        <w:t>Education</w:t>
       </w:r>
     </w:p>
     <w:p>
       <w:pPr>
         <w:tabs>
-          <w:tab w:pos="10080" w:val="right"/>
+          <w:tab w:pos="10224" w:val="right"/>
         </w:tabs>
-        <w:spacing w:before="60" w:after="40"/>
+        <w:spacing w:before="120" w:after="0"/>
       </w:pPr>
       <w:r>
         <w:rPr>
+          <w:rFonts w:ascii="Calibri" w:hAnsi="Calibri" w:eastAsia="Calibri"/>
           <w:b/>
-          <w:sz w:val="20"/>
+          <w:color w:val="142038"/>
+          <w:sz w:val="22"/>
         </w:rPr>
         <w:t>Master of Science (M.S.) in Computer Science</w:t>
       </w:r>
       <w:r>
         <w:rPr>
+          <w:rFonts w:ascii="Calibri" w:hAnsi="Calibri" w:eastAsia="Calibri"/>
           <w:b/>
-          <w:sz w:val="19"/>
+          <w:color w:val="142038"/>
+          <w:sz w:val="20"/>
         </w:rPr>
         <w:tab/>
         <w:t>Sep 2023 – May 2025</w:t>
       </w:r>
     </w:p>
     <w:p>
-      <w:pPr>
-        <w:spacing w:after="80"/>
-      </w:pPr>
       <w:r>
         <w:rPr>
-          <w:i/>
-          <w:sz w:val="19"/>
+          <w:rFonts w:ascii="Calibri" w:hAnsi="Calibri" w:eastAsia="Calibri"/>
+          <w:b w:val="0"/>
+          <w:color w:val="1C2026"/>
+          <w:sz w:val="21"/>
         </w:rPr>
         <w:t>Pace University – Seidenberg School of CS &amp; IS, New York, NY (GPA: 3.55 / 4.0)</w:t>
       </w:r>
     </w:p>
-    <w:p>
-      <w:pPr>
-        <w:tabs>
-          <w:tab w:pos="10080" w:val="right"/>
-        </w:tabs>
-        <w:spacing w:before="40" w:after="40"/>
-      </w:pPr>
-      <w:r>
-        <w:rPr>
-          <w:b/>
-          <w:sz w:val="20"/>
-        </w:rPr>
-        <w:t>Bachelor of Technology (B.Tech) in Electrical, Electronics &amp; Communication Engineering</w:t>
-      </w:r>
-      <w:r>
-        <w:rPr>
-          <w:b/>
-          <w:sz w:val="19"/>
-        </w:rPr>
-        <w:tab/>
-        <w:t>2016 – 2020</w:t>
-      </w:r>
-    </w:p>
-    <w:p>
-      <w:pPr>
-        <w:spacing w:after="80"/>
-      </w:pPr>
-      <w:r>
-        <w:rPr>
-          <w:i/>
-          <w:sz w:val="19"/>
-        </w:rPr>
-        <w:t>Tirumala Engineering College, Andhra Pradesh, India</w:t>
-      </w:r>
-    </w:p>
     <w:sectPr>
       <w:pgSz w:w="12240" w:h="15840"/>
-      <w:pgMar w:top="1080" w:right="1080" w:bottom="1080" w:left="1080" w:header="720" w:footer="720" w:gutter="0"/>
+      <w:pgMar w:top="864" w:right="1008" w:bottom="864" w:left="1008" w:header="720" w:footer="720" w:gutter="0"/>
       <w:cols w:space="720"/>
       <w:docGrid w:linePitch="360"/>
     </w:sectPr>
@@ -1105,10 +1112,12 @@
     <w:name w:val="Normal"/>
     <w:qFormat/>
     <w:rsid w:val="00FC693F"/>
+    <w:pPr>
+      <w:spacing w:after="40" w:line="259" w:lineRule="auto"/>
+    </w:pPr>
     <w:rPr>
-      <w:rFonts w:ascii="Times New Roman" w:hAnsi="Times New Roman"/>
-      <w:color w:val="000000"/>
-      <w:sz w:val="20"/>
+      <w:rFonts w:ascii="Calibri" w:hAnsi="Calibri"/>
+      <w:sz w:val="21"/>
     </w:rPr>
   </w:style>
   <w:style w:type="paragraph" w:styleId="Header">

</xml_diff>

<commit_message>
Restyle portfolio as Netflix Developer Series in red and black
Replace the cyan cyber loader with the series card model: red banner,
SUNKARA / AUTO.ENGINE hero, portrait glow card, episode sections, and
3D skill/project cards. Strip Cognizant and bachelor’s details from
the resume files.

Co-authored-by: Dineshgopi Sunkara <sunkara1111@users.noreply.github.com>
</commit_message>
<xml_diff>
--- a/public/assets/Sunkara-Dineshgopi-Resume.docx
+++ b/public/assets/Sunkara-Dineshgopi-Resume.docx
@@ -4,13 +4,14 @@
   <w:body>
     <w:p>
       <w:pPr>
-        <w:spacing w:before="0" w:after="40"/>
+        <w:spacing w:after="40" w:before="0"/>
         <w:jc w:val="center"/>
       </w:pPr>
       <w:r>
         <w:rPr>
-          <w:rFonts w:ascii="Times New Roman" w:hAnsi="Times New Roman"/>
+          <w:rFonts w:ascii="Calibri" w:hAnsi="Calibri"/>
           <w:b/>
+          <w:color w:val="000000"/>
           <w:sz w:val="36"/>
         </w:rPr>
         <w:t>Sunkara Dineshgopi</w:t>
@@ -18,12 +19,14 @@
     </w:p>
     <w:p>
       <w:pPr>
-        <w:spacing w:after="160"/>
+        <w:spacing w:after="40" w:before="0"/>
         <w:jc w:val="center"/>
       </w:pPr>
       <w:r>
         <w:rPr>
-          <w:rFonts w:ascii="Times New Roman" w:hAnsi="Times New Roman"/>
+          <w:rFonts w:ascii="Calibri" w:hAnsi="Calibri"/>
+          <w:b w:val="0"/>
+          <w:color w:val="000000"/>
           <w:sz w:val="20"/>
         </w:rPr>
         <w:t>M: 201-284-1559   |   E: dineshgopi.sunkara@gmail.com</w:t>
@@ -31,710 +34,479 @@
     </w:p>
     <w:p>
       <w:pPr>
-        <w:keepNext/>
-        <w:spacing w:before="240" w:after="60"/>
-        <w:pBdr>
-          <w:bottom w:val="single" w:sz="6" w:space="1" w:color="000000"/>
-        </w:pBdr>
+        <w:spacing w:after="80" w:before="200"/>
       </w:pPr>
       <w:r>
         <w:rPr>
-          <w:rFonts w:ascii="Times New Roman" w:hAnsi="Times New Roman"/>
+          <w:rFonts w:ascii="Calibri" w:hAnsi="Calibri"/>
           <w:b/>
-          <w:sz w:val="22"/>
+          <w:color w:val="E50914"/>
+          <w:sz w:val="24"/>
         </w:rPr>
-        <w:t>Summary:</w:t>
+        <w:t>Summary</w:t>
       </w:r>
     </w:p>
     <w:p>
       <w:pPr>
-        <w:spacing w:after="80" w:line="276" w:lineRule="auto"/>
+        <w:spacing w:after="80" w:before="0"/>
       </w:pPr>
       <w:r>
-        <w:t>Results-driven Automation &amp; Controls Engineer and manufacturing quality professional specializing in industrial automation, Operational Technology (OT) platforms, Building Management Systems (BMS), and software architecture within highly regulated GxP / GMP environments. Combines an interdisciplinary engineering foundation across Information Technology (IT), Electronics &amp; Communication Engineering (ECE), and Computer Science (CS) to bridge the gap between physical plant machinery and complex software systems. Proven expertise in PLC/DCS architectures, SCADA design (Ignition, AVEVA), full-stack microservices development, cloud deployment, and strict data integrity compliance across pharmaceutical and industrial manufacturing lines.</w:t>
+        <w:rPr>
+          <w:rFonts w:ascii="Calibri" w:hAnsi="Calibri"/>
+          <w:b w:val="0"/>
+          <w:sz w:val="20"/>
+        </w:rPr>
+        <w:t>Results-driven Automation &amp; Controls Engineer and manufacturing quality professional specializing in industrial automation, Operational Technology (OT) platforms, Building Management Systems (BMS), and software architecture within highly regulated GxP / GMP environments. Combines an interdisciplinary foundation across Information Technology (IT) and Computer Science (CS) to bridge physical plant machinery and complex software systems. Proven expertise in PLC/DCS architectures, SCADA design (Ignition, AVEVA), full-stack microservices development, cloud deployment, and data-integrity compliance across pharmaceutical and industrial manufacturing lines.</w:t>
       </w:r>
     </w:p>
     <w:p>
       <w:pPr>
-        <w:keepNext/>
-        <w:spacing w:before="240" w:after="60"/>
-        <w:pBdr>
-          <w:bottom w:val="single" w:sz="6" w:space="1" w:color="000000"/>
-        </w:pBdr>
+        <w:spacing w:after="80" w:before="200"/>
       </w:pPr>
       <w:r>
         <w:rPr>
-          <w:rFonts w:ascii="Times New Roman" w:hAnsi="Times New Roman"/>
+          <w:rFonts w:ascii="Calibri" w:hAnsi="Calibri"/>
           <w:b/>
-          <w:sz w:val="22"/>
+          <w:color w:val="E50914"/>
+          <w:sz w:val="24"/>
         </w:rPr>
-        <w:t>Skills:</w:t>
+        <w:t>Skills</w:t>
       </w:r>
     </w:p>
     <w:p>
       <w:pPr>
-        <w:pStyle w:val="ListBullet"/>
-        <w:spacing w:after="50" w:line="276" w:lineRule="auto"/>
+        <w:spacing w:after="40" w:before="0"/>
       </w:pPr>
       <w:r>
         <w:rPr>
-          <w:rFonts w:ascii="Times New Roman" w:hAnsi="Times New Roman"/>
-          <w:b/>
+          <w:rFonts w:ascii="Calibri" w:hAnsi="Calibri"/>
+          <w:b w:val="0"/>
+          <w:sz w:val="19"/>
         </w:rPr>
-        <w:t xml:space="preserve">Automation &amp; Control Systems: </w:t>
-      </w:r>
-      <w:r>
-        <w:rPr>
-          <w:rFonts w:ascii="Times New Roman" w:hAnsi="Times New Roman"/>
-        </w:rPr>
-        <w:t>PLC (Allen-Bradley, Siemens), DCS (DeltaV), SCADA (Ignition, FactoryTalk View, AVEVA), HMI Development, Vision Sensors, Sterile Fill-Finish Lines</w:t>
+        <w:t>• Automation &amp; Control Systems: PLC (Allen-Bradley, Siemens), DCS (DeltaV), SCADA (Ignition, FactoryTalk View, AVEVA), HMI Development, Vision Sensors, Sterile Fill-Finish Lines</w:t>
       </w:r>
     </w:p>
     <w:p>
       <w:pPr>
-        <w:pStyle w:val="ListBullet"/>
-        <w:spacing w:after="50" w:line="276" w:lineRule="auto"/>
+        <w:spacing w:after="40" w:before="0"/>
       </w:pPr>
       <w:r>
         <w:rPr>
-          <w:rFonts w:ascii="Times New Roman" w:hAnsi="Times New Roman"/>
-          <w:b/>
+          <w:rFonts w:ascii="Calibri" w:hAnsi="Calibri"/>
+          <w:b w:val="0"/>
+          <w:sz w:val="19"/>
         </w:rPr>
-        <w:t xml:space="preserve">Programming &amp; Configuration: </w:t>
-      </w:r>
-      <w:r>
-        <w:rPr>
-          <w:rFonts w:ascii="Times New Roman" w:hAnsi="Times New Roman"/>
-        </w:rPr>
-        <w:t>Rockwell Studio 5000, RSLogix 500/5000, Ladder Logic, Structured Text, Python, JavaScript, Java (Spring Boot, Hibernate), SQL</w:t>
+        <w:t>• Programming &amp; Configuration: Rockwell Studio 5000, RSLogix 500/5000, Ladder Logic, Structured Text, Python, JavaScript, Java (Spring Boot, Hibernate), SQL</w:t>
       </w:r>
     </w:p>
     <w:p>
       <w:pPr>
-        <w:pStyle w:val="ListBullet"/>
-        <w:spacing w:after="50" w:line="276" w:lineRule="auto"/>
+        <w:spacing w:after="40" w:before="0"/>
       </w:pPr>
       <w:r>
         <w:rPr>
-          <w:rFonts w:ascii="Times New Roman" w:hAnsi="Times New Roman"/>
-          <w:b/>
+          <w:rFonts w:ascii="Calibri" w:hAnsi="Calibri"/>
+          <w:b w:val="0"/>
+          <w:sz w:val="19"/>
         </w:rPr>
-        <w:t xml:space="preserve">MES &amp; Digital Systems: </w:t>
-      </w:r>
-      <w:r>
-        <w:rPr>
-          <w:rFonts w:ascii="Times New Roman" w:hAnsi="Times New Roman"/>
-        </w:rPr>
-        <w:t>Syncade, MasterControl, Electronic Batch Records (EBR), Recipe Authoring, MES–DCS Integration, MES Transactions</w:t>
+        <w:t>• MES &amp; Digital Systems: Syncade, MasterControl, Electronic Batch Records (EBR), Recipe Authoring, MES–DCS Integration, MES Transactions</w:t>
       </w:r>
     </w:p>
     <w:p>
       <w:pPr>
-        <w:pStyle w:val="ListBullet"/>
-        <w:spacing w:after="50" w:line="276" w:lineRule="auto"/>
+        <w:spacing w:after="40" w:before="0"/>
       </w:pPr>
       <w:r>
         <w:rPr>
-          <w:rFonts w:ascii="Times New Roman" w:hAnsi="Times New Roman"/>
-          <w:b/>
+          <w:rFonts w:ascii="Calibri" w:hAnsi="Calibri"/>
+          <w:b w:val="0"/>
+          <w:sz w:val="19"/>
         </w:rPr>
-        <w:t xml:space="preserve">Validation &amp; Compliance: </w:t>
-      </w:r>
-      <w:r>
-        <w:rPr>
-          <w:rFonts w:ascii="Times New Roman" w:hAnsi="Times New Roman"/>
-        </w:rPr>
-        <w:t>GMP, GxP, 21 CFR Part 11, GAMP 5, IQ/OQ/UAT, FAT/SAT, Change Control, CAPA, Data Integrity, System Risk Assessment</w:t>
+        <w:t>• Validation &amp; Compliance: GMP, GxP, 21 CFR Part 11, GAMP 5, IQ/OQ/UAT, FAT/SAT, Change Control, CAPA, Data Integrity, System Risk Assessment</w:t>
       </w:r>
     </w:p>
     <w:p>
       <w:pPr>
-        <w:pStyle w:val="ListBullet"/>
-        <w:spacing w:after="50" w:line="276" w:lineRule="auto"/>
+        <w:spacing w:after="40" w:before="0"/>
       </w:pPr>
       <w:r>
         <w:rPr>
-          <w:rFonts w:ascii="Times New Roman" w:hAnsi="Times New Roman"/>
-          <w:b/>
+          <w:rFonts w:ascii="Calibri" w:hAnsi="Calibri"/>
+          <w:b w:val="0"/>
+          <w:sz w:val="19"/>
         </w:rPr>
-        <w:t xml:space="preserve">Batch &amp; Process Standards: </w:t>
-      </w:r>
-      <w:r>
-        <w:rPr>
-          <w:rFonts w:ascii="Times New Roman" w:hAnsi="Times New Roman"/>
-        </w:rPr>
-        <w:t>ISA S88, ISA S95, Batch Process Design, Recipe Management, Process Optimization</w:t>
+        <w:t>• Batch &amp; Process Standards: ISA S88, ISA S95, Batch Process Design, Recipe Management, Process Optimization</w:t>
       </w:r>
     </w:p>
     <w:p>
       <w:pPr>
-        <w:pStyle w:val="ListBullet"/>
-        <w:spacing w:after="50" w:line="276" w:lineRule="auto"/>
+        <w:spacing w:after="40" w:before="0"/>
       </w:pPr>
       <w:r>
         <w:rPr>
-          <w:rFonts w:ascii="Times New Roman" w:hAnsi="Times New Roman"/>
-          <w:b/>
+          <w:rFonts w:ascii="Calibri" w:hAnsi="Calibri"/>
+          <w:b w:val="0"/>
+          <w:sz w:val="19"/>
         </w:rPr>
-        <w:t xml:space="preserve">Networking/Integration: </w:t>
-      </w:r>
-      <w:r>
-        <w:rPr>
-          <w:rFonts w:ascii="Times New Roman" w:hAnsi="Times New Roman"/>
-        </w:rPr>
-        <w:t>OPC, Ethernet/IP, Industrial Networks, System Integration, SQL Server (ODBC/DSN Connectivity), Data Historians (OSI PI)</w:t>
+        <w:t>• Networking/Integration: OPC, Ethernet/IP, Industrial Networks, System Integration, SQL Server (ODBC/DSN Connectivity), Data Historians (OSI PI)</w:t>
       </w:r>
     </w:p>
     <w:p>
       <w:pPr>
-        <w:pStyle w:val="ListBullet"/>
-        <w:spacing w:after="50" w:line="276" w:lineRule="auto"/>
+        <w:spacing w:after="40" w:before="0"/>
       </w:pPr>
       <w:r>
         <w:rPr>
-          <w:rFonts w:ascii="Times New Roman" w:hAnsi="Times New Roman"/>
-          <w:b/>
+          <w:rFonts w:ascii="Calibri" w:hAnsi="Calibri"/>
+          <w:b w:val="0"/>
+          <w:sz w:val="19"/>
         </w:rPr>
-        <w:t xml:space="preserve">Building &amp; Utility Systems: </w:t>
-      </w:r>
-      <w:r>
-        <w:rPr>
-          <w:rFonts w:ascii="Times New Roman" w:hAnsi="Times New Roman"/>
-        </w:rPr>
-        <w:t>BAS/BMS (Siemens Desigo, Insight), Environmental Monitoring Systems (EMS), Cleanroom Systems, Process Equipment Integration</w:t>
+        <w:t>• Building &amp; Utility Systems: BAS/BMS (Siemens Desigo, Insight), Environmental Monitoring Systems (EMS), Cleanroom Systems, Process Equipment Integration</w:t>
       </w:r>
     </w:p>
     <w:p>
       <w:pPr>
-        <w:pStyle w:val="ListBullet"/>
-        <w:spacing w:after="50" w:line="276" w:lineRule="auto"/>
+        <w:spacing w:after="40" w:before="0"/>
       </w:pPr>
       <w:r>
         <w:rPr>
-          <w:rFonts w:ascii="Times New Roman" w:hAnsi="Times New Roman"/>
-          <w:b/>
+          <w:rFonts w:ascii="Calibri" w:hAnsi="Calibri"/>
+          <w:b w:val="0"/>
+          <w:sz w:val="19"/>
         </w:rPr>
-        <w:t xml:space="preserve">Troubleshooting &amp; Maintenance: </w:t>
-      </w:r>
-      <w:r>
-        <w:rPr>
-          <w:rFonts w:ascii="Times New Roman" w:hAnsi="Times New Roman"/>
-        </w:rPr>
-        <w:t>Root Cause Analysis (RCA), PLC/SCADA Diagnostics, I/O &amp; Communication Failures, Preventive Maintenance</w:t>
+        <w:t>• Troubleshooting &amp; Maintenance: Root Cause Analysis (RCA), PLC/SCADA Diagnostics, I/O &amp; Communication Failures, Preventive Maintenance</w:t>
       </w:r>
     </w:p>
     <w:p>
       <w:pPr>
-        <w:pStyle w:val="ListBullet"/>
-        <w:spacing w:after="50" w:line="276" w:lineRule="auto"/>
+        <w:spacing w:after="40" w:before="0"/>
       </w:pPr>
       <w:r>
         <w:rPr>
-          <w:rFonts w:ascii="Times New Roman" w:hAnsi="Times New Roman"/>
-          <w:b/>
+          <w:rFonts w:ascii="Calibri" w:hAnsi="Calibri"/>
+          <w:b w:val="0"/>
+          <w:sz w:val="19"/>
         </w:rPr>
-        <w:t xml:space="preserve">Software &amp; Cloud Infrastructure: </w:t>
-      </w:r>
-      <w:r>
-        <w:rPr>
-          <w:rFonts w:ascii="Times New Roman" w:hAnsi="Times New Roman"/>
-        </w:rPr>
-        <w:t>Microservices Architecture, RESTful &amp; SOAP Web Services, Docker, Jenkins, Git, AWS, Azure, CI/CD Pipelines, JUnit, Mockito</w:t>
+        <w:t>• Software &amp; Cloud Infrastructure: Microservices Architecture, RESTful &amp; SOAP Web Services, Docker, Jenkins, Git, AWS, Azure, CI/CD Pipelines, JUnit, Mockito</w:t>
       </w:r>
     </w:p>
     <w:p>
       <w:pPr>
-        <w:keepNext/>
-        <w:spacing w:before="240" w:after="60"/>
-        <w:pBdr>
-          <w:bottom w:val="single" w:sz="6" w:space="1" w:color="000000"/>
-        </w:pBdr>
+        <w:spacing w:after="80" w:before="200"/>
       </w:pPr>
       <w:r>
         <w:rPr>
-          <w:rFonts w:ascii="Times New Roman" w:hAnsi="Times New Roman"/>
+          <w:rFonts w:ascii="Calibri" w:hAnsi="Calibri"/>
           <w:b/>
-          <w:sz w:val="22"/>
+          <w:color w:val="E50914"/>
+          <w:sz w:val="24"/>
         </w:rPr>
-        <w:t>Experience:</w:t>
+        <w:t>Experience</w:t>
       </w:r>
     </w:p>
     <w:p>
       <w:pPr>
-        <w:tabs>
-          <w:tab w:pos="10080" w:val="right"/>
-        </w:tabs>
-        <w:spacing w:before="120" w:after="20"/>
+        <w:spacing w:after="0" w:before="0"/>
       </w:pPr>
       <w:r>
         <w:rPr>
-          <w:rFonts w:ascii="Times New Roman" w:hAnsi="Times New Roman"/>
+          <w:rFonts w:ascii="Calibri" w:hAnsi="Calibri"/>
           <w:b/>
-          <w:sz w:val="21"/>
+          <w:sz w:val="22"/>
         </w:rPr>
         <w:t>Jubilant HollisterStier | Spokane, WA (On-Site)</w:t>
-      </w:r>
-      <w:r>
-        <w:rPr>
-          <w:rFonts w:ascii="Times New Roman" w:hAnsi="Times New Roman"/>
-          <w:b/>
-          <w:sz w:val="20"/>
-        </w:rPr>
-        <w:tab/>
-        <w:t>Jun 2026 – Present</w:t>
       </w:r>
     </w:p>
     <w:p>
       <w:pPr>
-        <w:spacing w:before="0" w:after="40"/>
+        <w:spacing w:after="40" w:before="0"/>
       </w:pPr>
       <w:r>
         <w:rPr>
-          <w:rFonts w:ascii="Times New Roman" w:hAnsi="Times New Roman"/>
-          <w:i/>
+          <w:rFonts w:ascii="Calibri" w:hAnsi="Calibri"/>
+          <w:b/>
           <w:sz w:val="20"/>
         </w:rPr>
-        <w:t>Automation Engineer</w:t>
+        <w:t>Automation Engineer    Jun 2026 – Present</w:t>
       </w:r>
     </w:p>
     <w:p>
       <w:pPr>
-        <w:pStyle w:val="ListBullet"/>
-        <w:spacing w:after="40" w:line="276" w:lineRule="auto"/>
+        <w:spacing w:after="40" w:before="0"/>
       </w:pPr>
       <w:r>
         <w:rPr>
-          <w:rFonts w:ascii="Times New Roman" w:hAnsi="Times New Roman"/>
+          <w:rFonts w:ascii="Calibri" w:hAnsi="Calibri"/>
+          <w:b w:val="0"/>
           <w:sz w:val="19"/>
         </w:rPr>
-        <w:t>Develop custom Ignition SCADA modules using Python and JavaScript scripting to automate data processing from vision sensors and generate dynamic operator dashboards for real-time plant monitoring.</w:t>
+        <w:t>• Develop custom Ignition SCADA modules using Python and JavaScript scripting to automate data processing from vision sensors and generate dynamic operator dashboards for real-time plant monitoring.</w:t>
       </w:r>
     </w:p>
     <w:p>
       <w:pPr>
-        <w:pStyle w:val="ListBullet"/>
-        <w:spacing w:after="40" w:line="276" w:lineRule="auto"/>
+        <w:spacing w:after="40" w:before="0"/>
       </w:pPr>
       <w:r>
         <w:rPr>
-          <w:rFonts w:ascii="Times New Roman" w:hAnsi="Times New Roman"/>
+          <w:rFonts w:ascii="Calibri" w:hAnsi="Calibri"/>
+          <w:b w:val="0"/>
           <w:sz w:val="19"/>
         </w:rPr>
-        <w:t>Design and implement an automated quality control system integrating Rockwell PLCs with AVEVA SCADA for centralized monitoring and real-time visualization of inspection metrics.</w:t>
+        <w:t>• Design and implement an automated quality control system integrating Rockwell PLCs with AVEVA SCADA for centralized monitoring and real-time visualization of inspection metrics.</w:t>
       </w:r>
     </w:p>
     <w:p>
       <w:pPr>
-        <w:pStyle w:val="ListBullet"/>
-        <w:spacing w:after="40" w:line="276" w:lineRule="auto"/>
+        <w:spacing w:after="40" w:before="0"/>
       </w:pPr>
       <w:r>
         <w:rPr>
-          <w:rFonts w:ascii="Times New Roman" w:hAnsi="Times New Roman"/>
+          <w:rFonts w:ascii="Calibri" w:hAnsi="Calibri"/>
+          <w:b w:val="0"/>
           <w:sz w:val="19"/>
         </w:rPr>
-        <w:t>Direct the integration, programming, and troubleshooting of control systems with sterile fill-finish lines, managing automated workflows across laboratory and pharmaceutical manufacturing environments.</w:t>
+        <w:t>• Direct the integration, programming, and troubleshooting of control systems with sterile fill-finish lines, managing automated workflows across laboratory and pharmaceutical manufacturing environments.</w:t>
       </w:r>
     </w:p>
     <w:p>
       <w:pPr>
-        <w:pStyle w:val="ListBullet"/>
-        <w:spacing w:after="40" w:line="276" w:lineRule="auto"/>
+        <w:spacing w:after="40" w:before="0"/>
       </w:pPr>
       <w:r>
         <w:rPr>
-          <w:rFonts w:ascii="Times New Roman" w:hAnsi="Times New Roman"/>
+          <w:rFonts w:ascii="Calibri" w:hAnsi="Calibri"/>
+          <w:b w:val="0"/>
           <w:sz w:val="19"/>
         </w:rPr>
-        <w:t>Configure and validate ODBC and DSN connectivity between OT applications and SQL Server databases to support Environmental Monitoring Systems (EMS) and OT data capture on filling lines.</w:t>
+        <w:t>• Configure and validate ODBC and DSN connectivity between OT applications and SQL Server databases to support Environmental Monitoring Systems (EMS) and OT data capture on filling lines.</w:t>
       </w:r>
     </w:p>
     <w:p>
       <w:pPr>
-        <w:pStyle w:val="ListBullet"/>
-        <w:spacing w:after="40" w:line="276" w:lineRule="auto"/>
+        <w:spacing w:after="40" w:before="0"/>
       </w:pPr>
       <w:r>
         <w:rPr>
-          <w:rFonts w:ascii="Times New Roman" w:hAnsi="Times New Roman"/>
+          <w:rFonts w:ascii="Calibri" w:hAnsi="Calibri"/>
+          <w:b w:val="0"/>
           <w:sz w:val="19"/>
         </w:rPr>
-        <w:t>Integrate automation systems with SQL Server databases for production data logging, compliance reporting, and Manufacturing Execution System (MES) transactions while executing structured system risk assessments.</w:t>
+        <w:t>• Integrate automation systems with SQL Server databases for production data logging, compliance reporting, and Manufacturing Execution System (MES) transactions while executing structured system risk assessments.</w:t>
       </w:r>
     </w:p>
     <w:p>
       <w:pPr>
-        <w:tabs>
-          <w:tab w:pos="10080" w:val="right"/>
-        </w:tabs>
-        <w:spacing w:before="120" w:after="20"/>
+        <w:spacing w:after="0" w:before="0"/>
       </w:pPr>
       <w:r>
         <w:rPr>
-          <w:rFonts w:ascii="Times New Roman" w:hAnsi="Times New Roman"/>
+          <w:rFonts w:ascii="Calibri" w:hAnsi="Calibri"/>
           <w:b/>
-          <w:sz w:val="21"/>
+          <w:sz w:val="22"/>
         </w:rPr>
         <w:t>Source Sphere LLC | Edison, NJ (Hybrid)</w:t>
-      </w:r>
-      <w:r>
-        <w:rPr>
-          <w:rFonts w:ascii="Times New Roman" w:hAnsi="Times New Roman"/>
-          <w:b/>
-          <w:sz w:val="20"/>
-        </w:rPr>
-        <w:tab/>
-        <w:t>Nov 2025 – Jun 2026</w:t>
       </w:r>
     </w:p>
     <w:p>
       <w:pPr>
-        <w:spacing w:before="0" w:after="40"/>
+        <w:spacing w:after="40" w:before="0"/>
       </w:pPr>
       <w:r>
         <w:rPr>
-          <w:rFonts w:ascii="Times New Roman" w:hAnsi="Times New Roman"/>
-          <w:i/>
+          <w:rFonts w:ascii="Calibri" w:hAnsi="Calibri"/>
+          <w:b/>
           <w:sz w:val="20"/>
         </w:rPr>
-        <w:t>Software Engineer</w:t>
+        <w:t>Software Engineer    Nov 2025 – Jun 2026</w:t>
       </w:r>
     </w:p>
     <w:p>
       <w:pPr>
-        <w:pStyle w:val="ListBullet"/>
-        <w:spacing w:after="40" w:line="276" w:lineRule="auto"/>
+        <w:spacing w:after="40" w:before="0"/>
       </w:pPr>
       <w:r>
         <w:rPr>
-          <w:rFonts w:ascii="Times New Roman" w:hAnsi="Times New Roman"/>
+          <w:rFonts w:ascii="Calibri" w:hAnsi="Calibri"/>
+          <w:b w:val="0"/>
           <w:sz w:val="19"/>
         </w:rPr>
-        <w:t>Architected, developed, and deployed scalable Java-based applications and microservices using Spring Boot and Hibernate, seamlessly linking core CS algorithms with resilient IT infrastructure.</w:t>
+        <w:t>• Architected, developed, and deployed scalable Java-based applications and microservices using Spring Boot and Hibernate, linking core CS algorithms with resilient IT infrastructure.</w:t>
       </w:r>
     </w:p>
     <w:p>
       <w:pPr>
-        <w:pStyle w:val="ListBullet"/>
-        <w:spacing w:after="40" w:line="276" w:lineRule="auto"/>
+        <w:spacing w:after="40" w:before="0"/>
       </w:pPr>
       <w:r>
         <w:rPr>
-          <w:rFonts w:ascii="Times New Roman" w:hAnsi="Times New Roman"/>
+          <w:rFonts w:ascii="Calibri" w:hAnsi="Calibri"/>
+          <w:b w:val="0"/>
           <w:sz w:val="19"/>
         </w:rPr>
-        <w:t>Designed and integrated high-performance RESTful and SOAP-based web services to optimize application communication and ensure smooth UI integration with frontend engineering teams.</w:t>
+        <w:t>• Designed and integrated high-performance RESTful and SOAP-based web services to optimize application communication and UI integration with frontend engineering teams.</w:t>
       </w:r>
     </w:p>
     <w:p>
       <w:pPr>
-        <w:pStyle w:val="ListBullet"/>
-        <w:spacing w:after="40" w:line="276" w:lineRule="auto"/>
+        <w:spacing w:after="40" w:before="0"/>
       </w:pPr>
       <w:r>
         <w:rPr>
-          <w:rFonts w:ascii="Times New Roman" w:hAnsi="Times New Roman"/>
+          <w:rFonts w:ascii="Calibri" w:hAnsi="Calibri"/>
+          <w:b w:val="0"/>
           <w:sz w:val="19"/>
         </w:rPr>
-        <w:t>Managed end-to-end data modeling, schema design, and complex query development utilizing MySQL, PostgreSQL, and MongoDB, maintaining strict data integrity and performance standards.</w:t>
+        <w:t>• Managed end-to-end data modeling, schema design, and complex query development utilizing MySQL, PostgreSQL, and MongoDB, maintaining data integrity and performance standards.</w:t>
       </w:r>
     </w:p>
     <w:p>
       <w:pPr>
-        <w:pStyle w:val="ListBullet"/>
-        <w:spacing w:after="40" w:line="276" w:lineRule="auto"/>
+        <w:spacing w:after="40" w:before="0"/>
       </w:pPr>
       <w:r>
         <w:rPr>
-          <w:rFonts w:ascii="Times New Roman" w:hAnsi="Times New Roman"/>
+          <w:rFonts w:ascii="Calibri" w:hAnsi="Calibri"/>
+          <w:b w:val="0"/>
           <w:sz w:val="19"/>
         </w:rPr>
-        <w:t>Drove continuous integration and deployment (CI/CD) workflows by contributing to automated pipelines using Jenkins, Git, and Docker across AWS and Azure cloud platforms.</w:t>
+        <w:t>• Drove CI/CD workflows by contributing to automated pipelines using Jenkins, Git, and Docker across AWS and Azure cloud platforms.</w:t>
       </w:r>
     </w:p>
     <w:p>
       <w:pPr>
-        <w:pStyle w:val="ListBullet"/>
-        <w:spacing w:after="40" w:line="276" w:lineRule="auto"/>
+        <w:spacing w:after="40" w:before="0"/>
       </w:pPr>
       <w:r>
         <w:rPr>
-          <w:rFonts w:ascii="Times New Roman" w:hAnsi="Times New Roman"/>
+          <w:rFonts w:ascii="Calibri" w:hAnsi="Calibri"/>
+          <w:b w:val="0"/>
           <w:sz w:val="19"/>
         </w:rPr>
-        <w:t>Guided the full Software Development Lifecycle (SDLC), ensuring code reliability through JUnit and Mockito unit testing, conducting peer code reviews, and optimizing performance via caching and code tuning.</w:t>
+        <w:t>• Guided the full Software Development Lifecycle (SDLC), ensuring code reliability through JUnit and Mockito unit testing, peer code reviews, and performance tuning.</w:t>
       </w:r>
     </w:p>
     <w:p>
       <w:pPr>
-        <w:tabs>
-          <w:tab w:pos="10080" w:val="right"/>
-        </w:tabs>
-        <w:spacing w:before="120" w:after="20"/>
+        <w:spacing w:after="0" w:before="0"/>
       </w:pPr>
       <w:r>
         <w:rPr>
-          <w:rFonts w:ascii="Times New Roman" w:hAnsi="Times New Roman"/>
+          <w:rFonts w:ascii="Calibri" w:hAnsi="Calibri"/>
           <w:b/>
-          <w:sz w:val="21"/>
+          <w:sz w:val="22"/>
         </w:rPr>
-        <w:t>Cognizant | Chennai, India (Remote)</w:t>
-      </w:r>
-      <w:r>
-        <w:rPr>
-          <w:rFonts w:ascii="Times New Roman" w:hAnsi="Times New Roman"/>
-          <w:b/>
-          <w:sz w:val="20"/>
-        </w:rPr>
-        <w:tab/>
-        <w:t>Aug 2020 – Mar 2023</w:t>
+        <w:t>Andhra Pradesh State Skill Development Corporation (APSSDC) | Andhra Pradesh, India</w:t>
       </w:r>
     </w:p>
     <w:p>
       <w:pPr>
-        <w:spacing w:before="0" w:after="40"/>
+        <w:spacing w:after="40" w:before="0"/>
       </w:pPr>
       <w:r>
         <w:rPr>
-          <w:rFonts w:ascii="Times New Roman" w:hAnsi="Times New Roman"/>
-          <w:i/>
+          <w:rFonts w:ascii="Calibri" w:hAnsi="Calibri"/>
+          <w:b/>
           <w:sz w:val="20"/>
         </w:rPr>
-        <w:t>Program Analyst</w:t>
+        <w:t>Intern – Industrial Automation &amp; Controls    Apr 2019 – Apr 2020</w:t>
       </w:r>
     </w:p>
     <w:p>
       <w:pPr>
-        <w:pStyle w:val="ListBullet"/>
-        <w:spacing w:after="40" w:line="276" w:lineRule="auto"/>
+        <w:spacing w:after="40" w:before="0"/>
       </w:pPr>
       <w:r>
         <w:rPr>
-          <w:rFonts w:ascii="Times New Roman" w:hAnsi="Times New Roman"/>
+          <w:rFonts w:ascii="Calibri" w:hAnsi="Calibri"/>
+          <w:b w:val="0"/>
           <w:sz w:val="19"/>
         </w:rPr>
-        <w:t>Developed and deployed an automated reporting solution utilizing Python, SQL, and Power BI to streamline operational tracking, eliminating manual workflows to reclaim 20+ weekly hours while boosting data accuracy by 40%.</w:t>
+        <w:t>• Gained hands-on exposure to manufacturing industry ecosystems, industrial automation workflows, embedded microcontrollers, and production line lifecycles.</w:t>
       </w:r>
     </w:p>
     <w:p>
       <w:pPr>
-        <w:pStyle w:val="ListBullet"/>
-        <w:spacing w:after="40" w:line="276" w:lineRule="auto"/>
+        <w:spacing w:after="40" w:before="0"/>
       </w:pPr>
       <w:r>
         <w:rPr>
-          <w:rFonts w:ascii="Times New Roman" w:hAnsi="Times New Roman"/>
+          <w:rFonts w:ascii="Calibri" w:hAnsi="Calibri"/>
+          <w:b w:val="0"/>
           <w:sz w:val="19"/>
         </w:rPr>
-        <w:t>Partnered with cross-functional engineering and product teams to re-engineer core data pipelines, leveraging an interdisciplinary mix of IT, ECE, and CS to significantly improve data throughput and workflow reliability.</w:t>
+        <w:t>• Developed a foundational understanding of industrial control logic, including how Programmable Logic Controllers (PLCs) interface with supervisory software architectures to manage plant-floor equipment.</w:t>
       </w:r>
     </w:p>
     <w:p>
       <w:pPr>
-        <w:pStyle w:val="ListBullet"/>
-        <w:spacing w:after="40" w:line="276" w:lineRule="auto"/>
+        <w:spacing w:after="40" w:before="0"/>
       </w:pPr>
       <w:r>
         <w:rPr>
-          <w:rFonts w:ascii="Times New Roman" w:hAnsi="Times New Roman"/>
+          <w:rFonts w:ascii="Calibri" w:hAnsi="Calibri"/>
+          <w:b w:val="0"/>
           <w:sz w:val="19"/>
         </w:rPr>
-        <w:t>Led root cause analysis (RCA) for critical system errors and production incidents, implementing robust technical solutions that enhanced overall stability and slashed system downtime by 30%.</w:t>
+        <w:t>• Studied manufacturing documentation standards, safety regulations, and data tracking methods used to ensure precision and operational continuity in production environments.</w:t>
       </w:r>
     </w:p>
     <w:p>
       <w:pPr>
-        <w:pStyle w:val="ListBullet"/>
-        <w:spacing w:after="40" w:line="276" w:lineRule="auto"/>
+        <w:spacing w:after="40" w:before="0"/>
       </w:pPr>
       <w:r>
         <w:rPr>
-          <w:rFonts w:ascii="Times New Roman" w:hAnsi="Times New Roman"/>
+          <w:rFonts w:ascii="Calibri" w:hAnsi="Calibri"/>
+          <w:b w:val="0"/>
           <w:sz w:val="19"/>
         </w:rPr>
-        <w:t>Orchestrated the monthly generation and analysis of 50+ complex operational reports, delivering actionable insights that drove client system efficiency and informed strategic business decisions.</w:t>
+        <w:t>• Participated in cross-functional technical workshops aimed at deploying hardware-software integrations, sharpening troubleshooting, technical analysis, and systems validation capabilities.</w:t>
       </w:r>
     </w:p>
     <w:p>
       <w:pPr>
-        <w:tabs>
-          <w:tab w:pos="10080" w:val="right"/>
-        </w:tabs>
-        <w:spacing w:before="120" w:after="20"/>
+        <w:spacing w:after="80" w:before="200"/>
       </w:pPr>
       <w:r>
         <w:rPr>
-          <w:rFonts w:ascii="Times New Roman" w:hAnsi="Times New Roman"/>
+          <w:rFonts w:ascii="Calibri" w:hAnsi="Calibri"/>
           <w:b/>
-          <w:sz w:val="21"/>
+          <w:color w:val="E50914"/>
+          <w:sz w:val="24"/>
         </w:rPr>
-        <w:t>Andhra Pradesh State Skill Development Corporation (APSSDC) | Andhra Pradesh, India</w:t>
-      </w:r>
-      <w:r>
-        <w:rPr>
-          <w:rFonts w:ascii="Times New Roman" w:hAnsi="Times New Roman"/>
-          <w:b/>
-          <w:sz w:val="20"/>
-        </w:rPr>
-        <w:tab/>
-        <w:t>Apr 2019 – Apr 2020</w:t>
+        <w:t>Education</w:t>
       </w:r>
     </w:p>
     <w:p>
       <w:pPr>
-        <w:spacing w:before="0" w:after="40"/>
+        <w:spacing w:after="0" w:before="0"/>
       </w:pPr>
       <w:r>
         <w:rPr>
-          <w:rFonts w:ascii="Times New Roman" w:hAnsi="Times New Roman"/>
-          <w:i/>
-          <w:sz w:val="20"/>
+          <w:rFonts w:ascii="Calibri" w:hAnsi="Calibri"/>
+          <w:b/>
+          <w:sz w:val="22"/>
         </w:rPr>
-        <w:t>Intern – Industrial Automation &amp; Controls</w:t>
+        <w:t>Master of Science (M.S.) in Computer Science</w:t>
       </w:r>
     </w:p>
     <w:p>
       <w:pPr>
-        <w:pStyle w:val="ListBullet"/>
-        <w:spacing w:after="40" w:line="276" w:lineRule="auto"/>
+        <w:spacing w:after="40" w:before="0"/>
       </w:pPr>
       <w:r>
         <w:rPr>
-          <w:rFonts w:ascii="Times New Roman" w:hAnsi="Times New Roman"/>
-          <w:sz w:val="19"/>
-        </w:rPr>
-        <w:t>Gained hands-on exposure to core manufacturing industry ecosystems, industrial automation workflows, embedded microcontrollers, and production line lifecycles.</w:t>
-      </w:r>
-    </w:p>
-    <w:p>
-      <w:pPr>
-        <w:pStyle w:val="ListBullet"/>
-        <w:spacing w:after="40" w:line="276" w:lineRule="auto"/>
-      </w:pPr>
-      <w:r>
-        <w:rPr>
-          <w:rFonts w:ascii="Times New Roman" w:hAnsi="Times New Roman"/>
-          <w:sz w:val="19"/>
-        </w:rPr>
-        <w:t>Developed a foundational understanding of industrial control logic, including how Programmable Logic Controllers (PLCs) interface with supervisory software architectures to manage plant floor equipment.</w:t>
-      </w:r>
-    </w:p>
-    <w:p>
-      <w:pPr>
-        <w:pStyle w:val="ListBullet"/>
-        <w:spacing w:after="40" w:line="276" w:lineRule="auto"/>
-      </w:pPr>
-      <w:r>
-        <w:rPr>
-          <w:rFonts w:ascii="Times New Roman" w:hAnsi="Times New Roman"/>
-          <w:sz w:val="19"/>
-        </w:rPr>
-        <w:t>Studied manufacturing documentation standards, safety regulations, and data tracking methods used to ensure precision, structural reliability, and operational continuity in fast-paced production environments.</w:t>
-      </w:r>
-    </w:p>
-    <w:p>
-      <w:pPr>
-        <w:pStyle w:val="ListBullet"/>
-        <w:spacing w:after="40" w:line="276" w:lineRule="auto"/>
-      </w:pPr>
-      <w:r>
-        <w:rPr>
-          <w:rFonts w:ascii="Times New Roman" w:hAnsi="Times New Roman"/>
-          <w:sz w:val="19"/>
-        </w:rPr>
-        <w:t>Participated in cross-functional technical workshops aimed at deploying hardware-software integrations, sharpening troubleshooting, technical analysis, and systems validation capabilities.</w:t>
-      </w:r>
-    </w:p>
-    <w:p>
-      <w:pPr>
-        <w:keepNext/>
-        <w:spacing w:before="240" w:after="60"/>
-        <w:pBdr>
-          <w:bottom w:val="single" w:sz="6" w:space="1" w:color="000000"/>
-        </w:pBdr>
-      </w:pPr>
-      <w:r>
-        <w:rPr>
-          <w:rFonts w:ascii="Times New Roman" w:hAnsi="Times New Roman"/>
-          <w:b/>
-          <w:sz w:val="22"/>
-        </w:rPr>
-        <w:t>Education:</w:t>
-      </w:r>
-    </w:p>
-    <w:p>
-      <w:pPr>
-        <w:tabs>
-          <w:tab w:pos="10080" w:val="right"/>
-        </w:tabs>
-        <w:spacing w:before="60" w:after="40"/>
-      </w:pPr>
-      <w:r>
-        <w:rPr>
-          <w:b/>
+          <w:rFonts w:ascii="Calibri" w:hAnsi="Calibri"/>
+          <w:b w:val="0"/>
           <w:sz w:val="20"/>
         </w:rPr>
-        <w:t>Master of Science (M.S.) in Computer Science</w:t>
-      </w:r>
-      <w:r>
-        <w:rPr>
-          <w:b/>
-          <w:sz w:val="19"/>
-        </w:rPr>
-        <w:tab/>
-        <w:t>Sep 2023 – May 2025</w:t>
-      </w:r>
-    </w:p>
-    <w:p>
-      <w:pPr>
-        <w:spacing w:after="80"/>
-      </w:pPr>
-      <w:r>
-        <w:rPr>
-          <w:i/>
-          <w:sz w:val="19"/>
-        </w:rPr>
-        <w:t>Pace University – Seidenberg School of CS &amp; IS, New York, NY (GPA: 3.55 / 4.0)</w:t>
-      </w:r>
-    </w:p>
-    <w:p>
-      <w:pPr>
-        <w:tabs>
-          <w:tab w:pos="10080" w:val="right"/>
-        </w:tabs>
-        <w:spacing w:before="40" w:after="40"/>
-      </w:pPr>
-      <w:r>
-        <w:rPr>
-          <w:b/>
-          <w:sz w:val="20"/>
-        </w:rPr>
-        <w:t>Bachelor of Technology (B.Tech) in Electrical, Electronics &amp; Communication Engineering</w:t>
-      </w:r>
-      <w:r>
-        <w:rPr>
-          <w:b/>
-          <w:sz w:val="19"/>
-        </w:rPr>
-        <w:tab/>
-        <w:t>2016 – 2020</w:t>
-      </w:r>
-    </w:p>
-    <w:p>
-      <w:pPr>
-        <w:spacing w:after="80"/>
-      </w:pPr>
-      <w:r>
-        <w:rPr>
-          <w:i/>
-          <w:sz w:val="19"/>
-        </w:rPr>
-        <w:t>Tirumala Engineering College, Andhra Pradesh, India</w:t>
+        <w:t>Pace University – Seidenberg School of CS &amp; IS, New York, NY (GPA: 3.55 / 4.0)    Sep 2023 – May 2025</w:t>
       </w:r>
     </w:p>
     <w:sectPr>
       <w:pgSz w:w="12240" w:h="15840"/>
-      <w:pgMar w:top="1080" w:right="1080" w:bottom="1080" w:left="1080" w:header="720" w:footer="720" w:gutter="0"/>
+      <w:pgMar w:top="864" w:right="1008" w:bottom="864" w:left="1008" w:header="720" w:footer="720" w:gutter="0"/>
       <w:cols w:space="720"/>
       <w:docGrid w:linePitch="360"/>
     </w:sectPr>
@@ -1105,11 +877,6 @@
     <w:name w:val="Normal"/>
     <w:qFormat/>
     <w:rsid w:val="00FC693F"/>
-    <w:rPr>
-      <w:rFonts w:ascii="Times New Roman" w:hAnsi="Times New Roman"/>
-      <w:color w:val="000000"/>
-      <w:sz w:val="20"/>
-    </w:rPr>
   </w:style>
   <w:style w:type="paragraph" w:styleId="Header">
     <w:name w:val="header"/>

</xml_diff>